<commit_message>
Update mobile screens, API services, ESP32 firmware, and documentation
</commit_message>
<xml_diff>
--- a/docs/SDD_Smart_Parking.docx
+++ b/docs/SDD_Smart_Parking.docx
@@ -996,7 +996,7 @@
         <w:jc w:val="both"/>
       </w:pPr>
       <w:r>
-        <w:t>Scannerul QR GM65 este conectat la ESP32 prin serial (RS-232) sau direct la server prin USB HID. Codul QR citit este transmis pe topic-ul MQTT parking/scan sau direct la endpoint-ul REST /parking/hardware-scan, în funcție de configurația hardware.</w:t>
+        <w:t>Scannerul QR GM65 este conectat la ESP32 prin serial (RS-232) sau direct la server prin USB HID. Codul QR citit este transmis pe topic-ul MQTT parking/scan sau direct la endpoint-ul REST /parking/hardware-scan, în funcție de configurația hardware. Banda LED WS2812B (date pe GPIO5, 15 LED-uri organizate în 5 coloane × 3 rânduri) este controlată cu biblioteca FastLED: verde (loc AVAILABLE), albastru (RESERVED), roșu (OCCUPIED). Un display LCD I2C (0x27, 16×2) afișează temperatura și starea locurilor curent ocupate.</w:t>
       </w:r>
     </w:p>
     <w:p>
@@ -1331,7 +1331,7 @@
         <w:jc w:val="both"/>
       </w:pPr>
       <w:r>
-        <w:t>Interfața administratorului extinde cea a utilizatorului standard cu file suplimentare: dashboard în timp real cu statistici (locuri disponibile/ocupate, sesiuni active), editor de parcare pentru configurarea coordonatelor și tarifului, scanner QR prin camera telefonului, vizualizator flux video live și vizualizator informații sistem (versiune, IP server, stare conexiuni).</w:t>
+        <w:t>Interfața administratorului extinde cea a utilizatorului standard cu file suplimentare: dashboard în timp real cu statistici (locuri disponibile/ocupate, sesiuni active), editor de parcare pentru configurarea coordonatelor și tarifului, scanner QR prin camera telefonului, vizualizator flux video live și vizualizator informații sistem (versiune, IP server, stare conexiuni) și ecranul AdminAlertsScreen (tab "Alerte") – panou de monitorizare a alertelor de sistem cu refresh automat la 5 secunde, bară de statistici (total/necitite), lista alertelor color-codificată după severitate (roșu=critic, portocaliu=avertisment) și buton de generare mock.</w:t>
       </w:r>
     </w:p>
     <w:p>
@@ -1376,7 +1376,7 @@
         <w:jc w:val="both"/>
       </w:pPr>
       <w:r>
-        <w:t>Modulul de locuri expune: GET /spots (lista tuturor locurilor cu stări), POST /spots (creare loc, admin), PATCH /spots/:id (actualizare stare sau coordonate, admin), DELETE /spots/:id (ștergere loc, admin). Toate endpoint-urile protejate utilizează JwtAuthGuard, iar cele de admin utilizează suplimentar RolesGuard cu decoratorul @Roles("admin").</w:t>
+        <w:t>Modulul de locuri expune: GET /spots (lista tuturor locurilor cu stări), POST /spots (creare loc, admin), PATCH /spots/:id (actualizare stare sau coordonate, admin), DELETE /spots/:id (ștergere loc, admin). Toate endpoint-urile protejate utilizează JwtAuthGuard, iar cele de admin utilizează suplimentar RolesGuard cu decoratorul @Roles("admin"). Modulul de alerte (sub prefixul /parking) expune: GET /parking/alerts (lista completă a alertelor + câmpul unreadCount; protejat JWT admin), POST /parking/alerts/read (marchează toate alertele ca citite; protejat JWT admin), POST /parking/alerts/mock (inserează 6 alerte predefinite de test; protejat JWT admin).</w:t>
       </w:r>
     </w:p>
     <w:p>
@@ -1407,7 +1407,7 @@
         <w:jc w:val="both"/>
       </w:pPr>
       <w:r>
-        <w:t>Topic-ul parking/commands este utilizat de server pentru a publica comenzile OPEN_ENTRY și OPEN_EXIT receptate de ESP32 pentru controlul barierelor. Topic-ul parking/status este publicat de server după fiecare schimbare de stare, conținând JSON cu lista completă a locurilor și stările lor curente. Topic-ul parking/environment primește datele de mediu de la senzori (temperatură, umiditate, presiune, flacără), iar topic-ul parking/speed primește date de la senzorul de viteză.</w:t>
+        <w:t>Topic-ul parking/commands este utilizat de server pentru a publica comenzile OPEN_ENTRY și OPEN_EXIT receptate de ESP32 pentru controlul barierelor. Topic-ul parking/status este publicat de server după fiecare schimbare de stare, conținând JSON cu lista completă a locurilor și stările lor curente. Topic-ul parking/environment primește datele de mediu de la senzori (temperatură, umiditate, presiune, flacără), iar topic-ul parking/speed primește date de la senzorul de viteză. Topic-ul parking/diagnostics primește la fiecare 2 secunde un JSON cu datele brute de diagnosticare: temperatura senzorilor, viteza curentă (km/h calculată din pulsuri IR), starea detectorilor de flacără și gaz, uptime ESP32. Acest topic alimentează atât logica de generare alerte din MqttService, cât și endpoint-ul GET /parking/admin-status.</w:t>
       </w:r>
     </w:p>
     <w:p>
@@ -1672,7 +1672,7 @@
         <w:jc w:val="both"/>
       </w:pPr>
       <w:r>
-        <w:t>La apăsarea unui buton BYPASS de deschidere a barierei, aplicația trimite o cerere autentificată (JWT cu rol admin) care publică direct comanda MQTT corespunzătoare. Administratorul poate accesa ecranul de configurare pentru a modifica tarifele sau coordonatele GPS, prin PATCH /parking/config cu verificarea rolului admin pe server. Postcondițiile: administratorul are vizibilitate completă și control operațional.</w:t>
+        <w:t>La apăsarea unui buton BYPASS de deschidere a barierei, aplicația trimite o cerere autentificată (JWT cu rol admin) care publică direct comanda MQTT corespunzătoare. Administratorul poate accesa ecranul de configurare pentru a modifica tarifele sau coordonatele GPS, prin PATCH /parking/config cu verificarea rolului admin pe server. Postcondițiile: administratorul are vizibilitate completă și control operațional. Administratorul poate accesa tab-ul "Alerte" pentru a vizualiza alertele de sistem: lista este actualizată automat la 5 secunde, alertele critice (flacără, depășire temperatură gravă) sunt evidențiate cu roșu, cele de avertisment cu portocaliu. La accesarea tab-ului, counterul de alerte necitite se resetează la zero. Prin butonul "Mock Alerte", administratorul poate genera alerte de test pentru a verifica funcționalitatea sistemului.</w:t>
       </w:r>
     </w:p>
     <w:p>
@@ -1803,7 +1803,7 @@
         <w:jc w:val="both"/>
       </w:pPr>
       <w:r>
-        <w:t>Procesarea mesajelor este asincronă. MqttService parsează payload-ul fiecărui mesaj și apelează metoda corespunzătoare din ParkingService sau SpotsService. Logica de reconectare implementează exponential backoff cu un număr maxim de 10 tentative, după care logul de erori este actualizat. Publicarea comenzilor utilizează metoda client.publish() cu QoS nivel 1 (cel puțin o dată) pentru comenzile de barieră.</w:t>
+        <w:t>Procesarea mesajelor este asincronă. MqttService parsează payload-ul fiecărui mesaj și apelează metoda corespunzătoare din ParkingService sau SpotsService. Logica de reconectare implementează exponential backoff cu un număr maxim de 10 tentative, după care logul de erori este actualizat. Publicarea comenzilor utilizează metoda client.publish() cu QoS nivel 1 (cel puțin o dată) pentru comenzile de barieră. MqttService menține un registru in-memory de alerte (_alerts: array, limitat la 200 înregistrări) populate prin metoda internă _pushAlert(). La primirea datelor pe parking/diagnostics, handleEnvironmentUpdate() verifică pragurile (temperatură &gt; 35°C → warning, &gt; 40°C → critical, flacără detectată → critical, gaz &gt; 700 → warning) și apelează _pushAlert(). La primirea datelor pe parking/speed, handleSpeedUpdate() compară viteza cu limita din ParkingConfig și apelează _pushAlert() la depășire. Metoda addMockAlerts() inserează 6 alerte predefinite (2 viteză, 2 temperatură, 1 flacără, 1 gaz) pentru demonstrații.</w:t>
       </w:r>
     </w:p>
     <w:p>
@@ -1929,7 +1929,7 @@
         <w:jc w:val="both"/>
       </w:pPr>
       <w:r>
-        <w:t>ParkingMapScreen utilizează GoogleMapController pentru manipularea hărții și un Timer.periodic de 3 secunde pentru polling-ul stărilor locurilor. Markerele sau poligoanele sunt recreate la fiecare actualizare cu culoarea corespunzătoare stării. NavigationScreen inițializează o cameră centrată pe locul alocat și desenează o Polyline cu 2 puncte: locația curentă (din geolocator) și coordonatele locului alocat.</w:t>
+        <w:t>ParkingMapScreen utilizează GoogleMapController pentru manipularea hărții și un Timer.periodic de 3 secunde pentru polling-ul stărilor locurilor. Markerele sau poligoanele sunt recreate la fiecare actualizare cu culoarea corespunzătoare stării. NavigationScreen inițializează o cameră centrată pe locul alocat și desenează o Polyline cu 2 puncte: locația curentă (din geolocator) și coordonatele locului alocat. DirectionalNavigationScreen (modul de navigare condus) pornește un Timer.periodic de 3 secunde care interoghează GET /parking/admin-status pentru viteza curentă din senzorul IR. Dacă viteza depășește limita configurată (implicit 10 km/h), se afișează un overlay AnimatedOpacity cu valoarea vitezei, limita și un buton de dismiss. Overlay-ul dispare automat după 5 secunde dacă nu este respins manual.</w:t>
       </w:r>
     </w:p>
     <w:p>

</xml_diff>